<commit_message>
fix: correct corresponding-author title-page styling
</commit_message>
<xml_diff>
--- a/06_manuscript/ijir_v0_1_20260720/03_submission_files/IJIR_Main_Manuscript_v0_1.docx
+++ b/06_manuscript/ijir_v0_1_20260720/03_submission_files/IJIR_Main_Manuscript_v0_1.docx
@@ -13,16 +13,7 @@
     </w:p>
     <w:p>
       <w:r>
-        <w:t>Xiancheng Du¹, Shuchun Tao¹, Kaihua Xue¹, Yongkun Zhu¹, Ming Chen²</w:t>
-      </w:r>
-      <w:r>
-        <w:rPr>
-          <w:i/>
-        </w:rPr>
-        <w:t>, Chunhui Liu²</w:t>
-      </w:r>
-      <w:r>
-        <w:t>, Chao Sun²*</w:t>
+        <w:t>Xiancheng Du¹, Shuchun Tao¹, Kaihua Xue¹, Yongkun Zhu¹, Ming Chen²†, Chunhui Liu²†, Chao Sun²†</w:t>
       </w:r>
     </w:p>
     <w:p>
@@ -37,13 +28,7 @@
     </w:p>
     <w:p>
       <w:r>
-        <w:rPr>
-          <w:i/>
-        </w:rPr>
-        <w:t>Correspondence:</w:t>
-      </w:r>
-      <w:r>
-        <w:t xml:space="preserve"> Ming Chen (mingchenseu@126.com), Chunhui Liu (liuc863@126.com), and Chao Sun (csun@seu.edu.cn), Department of Urology, Zhongda Hospital, Southeast University, 87 Dingjiaqiao Road, Nanjing, Jiangsu 210009, China. Chao Sun is the primary submission contact (ORCID: 0000-0003-0538-1239).</w:t>
+        <w:t>†Correspondence: Ming Chen (mingchenseu@126.com), Chunhui Liu (liuc863@126.com), and Chao Sun (csun@seu.edu.cn), Department of Urology, Zhongda Hospital, Southeast University, 87 Dingjiaqiao Road, Nanjing, Jiangsu 210009, China. Chao Sun is the primary submission contact (ORCID: 0000-0003-0538-1239).</w:t>
       </w:r>
     </w:p>
     <w:p>

</xml_diff>